<commit_message>
exam 1 study guides
</commit_message>
<xml_diff>
--- a/Exam1/Ch1_Study_Guide.docx
+++ b/Exam1/Ch1_Study_Guide.docx
@@ -3,6 +3,67 @@
 <w:document xmlns:wpc="http://schemas.microsoft.com/office/word/2010/wordprocessingCanvas" xmlns:cx="http://schemas.microsoft.com/office/drawing/2014/chartex" xmlns:cx1="http://schemas.microsoft.com/office/drawing/2015/9/8/chartex" xmlns:cx2="http://schemas.microsoft.com/office/drawing/2015/10/21/chartex" xmlns:cx3="http://schemas.microsoft.com/office/drawing/2016/5/9/chartex" xmlns:cx4="http://schemas.microsoft.com/office/drawing/2016/5/10/chartex" xmlns:cx5="http://schemas.microsoft.com/office/drawing/2016/5/11/chartex" xmlns:cx6="http://schemas.microsoft.com/office/drawing/2016/5/12/chartex" xmlns:cx7="http://schemas.microsoft.com/office/drawing/2016/5/13/chartex" xmlns:cx8="http://schemas.microsoft.com/office/drawing/2016/5/14/chartex" xmlns:mc="http://schemas.openxmlformats.org/markup-compatibility/2006" xmlns:aink="http://schemas.microsoft.com/office/drawing/2016/ink" xmlns:am3d="http://schemas.microsoft.com/office/drawing/2017/model3d" xmlns:o="urn:schemas-microsoft-com:office:office" xmlns:oel="http://schemas.microsoft.com/office/2019/extlst" xmlns:r="http://schemas.openxmlformats.org/officeDocument/2006/relationships" xmlns:m="http://schemas.openxmlformats.org/officeDocument/2006/math" xmlns:v="urn:schemas-microsoft-com:vml" xmlns:wp14="http://schemas.microsoft.com/office/word/2010/wordprocessingDrawing" xmlns:wp="http://schemas.openxmlformats.org/drawingml/2006/wordprocessingDrawing" xmlns:w10="urn:schemas-microsoft-com:office:word" xmlns:w="http://schemas.openxmlformats.org/wordprocessingml/2006/main" xmlns:w14="http://schemas.microsoft.com/office/word/2010/wordml" xmlns:w15="http://schemas.microsoft.com/office/word/2012/wordml" xmlns:w16cex="http://schemas.microsoft.com/office/word/2018/wordml/cex" xmlns:w16cid="http://schemas.microsoft.com/office/word/2016/wordml/cid" xmlns:w16="http://schemas.microsoft.com/office/word/2018/wordml" xmlns:w16du="http://schemas.microsoft.com/office/word/2023/wordml/word16du" xmlns:w16sdtdh="http://schemas.microsoft.com/office/word/2020/wordml/sdtdatahash" xmlns:w16sdtfl="http://schemas.microsoft.com/office/word/2024/wordml/sdtformatlock" xmlns:w16se="http://schemas.microsoft.com/office/word/2015/wordml/symex" xmlns:wpg="http://schemas.microsoft.com/office/word/2010/wordprocessingGroup" xmlns:wpi="http://schemas.microsoft.com/office/word/2010/wordprocessingInk" xmlns:wne="http://schemas.microsoft.com/office/word/2006/wordml" xmlns:wps="http://schemas.microsoft.com/office/word/2010/wordprocessingShape" mc:Ignorable="w14 w15 w16se w16cid w16 w16cex w16sdtdh w16sdtfl w16du wp14">
   <w:body>
     <w:p>
+      <w:r>
+        <w:rPr>
+          <w:noProof/>
+        </w:rPr>
+        <w:drawing>
+          <wp:anchor distT="0" distB="0" distL="114300" distR="114300" simplePos="0" relativeHeight="251658240" behindDoc="1" locked="0" layoutInCell="1" allowOverlap="1" wp14:anchorId="39CDDE54" wp14:editId="2643A87D">
+            <wp:simplePos x="0" y="0"/>
+            <wp:positionH relativeFrom="column">
+              <wp:posOffset>3568312</wp:posOffset>
+            </wp:positionH>
+            <wp:positionV relativeFrom="paragraph">
+              <wp:posOffset>2012546</wp:posOffset>
+            </wp:positionV>
+            <wp:extent cx="3597275" cy="2611755"/>
+            <wp:effectExtent l="0" t="0" r="3175" b="0"/>
+            <wp:wrapNone/>
+            <wp:docPr id="1038358935" name="Picture 3"/>
+            <wp:cNvGraphicFramePr>
+              <a:graphicFrameLocks xmlns:a="http://schemas.openxmlformats.org/drawingml/2006/main" noChangeAspect="1"/>
+            </wp:cNvGraphicFramePr>
+            <a:graphic xmlns:a="http://schemas.openxmlformats.org/drawingml/2006/main">
+              <a:graphicData uri="http://schemas.openxmlformats.org/drawingml/2006/picture">
+                <pic:pic xmlns:pic="http://schemas.openxmlformats.org/drawingml/2006/picture">
+                  <pic:nvPicPr>
+                    <pic:cNvPr id="0" name="Picture 3"/>
+                    <pic:cNvPicPr>
+                      <a:picLocks noChangeAspect="1" noChangeArrowheads="1"/>
+                    </pic:cNvPicPr>
+                  </pic:nvPicPr>
+                  <pic:blipFill>
+                    <a:blip r:embed="rId5">
+                      <a:extLst>
+                        <a:ext uri="{28A0092B-C50C-407E-A947-70E740481C1C}">
+                          <a14:useLocalDpi xmlns:a14="http://schemas.microsoft.com/office/drawing/2010/main" val="0"/>
+                        </a:ext>
+                      </a:extLst>
+                    </a:blip>
+                    <a:srcRect/>
+                    <a:stretch>
+                      <a:fillRect/>
+                    </a:stretch>
+                  </pic:blipFill>
+                  <pic:spPr bwMode="auto">
+                    <a:xfrm>
+                      <a:off x="0" y="0"/>
+                      <a:ext cx="3597275" cy="2611755"/>
+                    </a:xfrm>
+                    <a:prstGeom prst="rect">
+                      <a:avLst/>
+                    </a:prstGeom>
+                    <a:noFill/>
+                    <a:ln>
+                      <a:noFill/>
+                    </a:ln>
+                  </pic:spPr>
+                </pic:pic>
+              </a:graphicData>
+            </a:graphic>
+          </wp:anchor>
+        </w:drawing>
+      </w:r>
       <w:r>
         <w:rPr>
           <w:noProof/>
@@ -25,7 +86,7 @@
                     </pic:cNvPicPr>
                   </pic:nvPicPr>
                   <pic:blipFill>
-                    <a:blip r:embed="rId5">
+                    <a:blip r:embed="rId6">
                       <a:extLst>
                         <a:ext uri="{28A0092B-C50C-407E-A947-70E740481C1C}">
                           <a14:useLocalDpi xmlns:a14="http://schemas.microsoft.com/office/drawing/2010/main" val="0"/>
@@ -76,7 +137,7 @@
                     <pic:cNvPicPr/>
                   </pic:nvPicPr>
                   <pic:blipFill>
-                    <a:blip r:embed="rId6"/>
+                    <a:blip r:embed="rId7"/>
                     <a:stretch>
                       <a:fillRect/>
                     </a:stretch>
@@ -101,7 +162,7 @@
           <w:noProof/>
         </w:rPr>
         <w:drawing>
-          <wp:inline distT="0" distB="0" distL="0" distR="0" wp14:anchorId="5D8CE989" wp14:editId="4DFFF4FD">
+          <wp:inline distT="0" distB="0" distL="0" distR="0" wp14:anchorId="5D8CE989" wp14:editId="0EB7A65C">
             <wp:extent cx="3681669" cy="2375065"/>
             <wp:effectExtent l="0" t="0" r="0" b="6350"/>
             <wp:docPr id="2051007675" name="Picture 2"/>
@@ -118,7 +179,7 @@
                     </pic:cNvPicPr>
                   </pic:nvPicPr>
                   <pic:blipFill>
-                    <a:blip r:embed="rId7">
+                    <a:blip r:embed="rId8">
                       <a:extLst>
                         <a:ext uri="{28A0092B-C50C-407E-A947-70E740481C1C}">
                           <a14:useLocalDpi xmlns:a14="http://schemas.microsoft.com/office/drawing/2010/main" val="0"/>
@@ -169,7 +230,7 @@
                     <pic:cNvPicPr/>
                   </pic:nvPicPr>
                   <pic:blipFill>
-                    <a:blip r:embed="rId8"/>
+                    <a:blip r:embed="rId9"/>
                     <a:stretch>
                       <a:fillRect/>
                     </a:stretch>
@@ -182,59 +243,6 @@
                     <a:prstGeom prst="rect">
                       <a:avLst/>
                     </a:prstGeom>
-                  </pic:spPr>
-                </pic:pic>
-              </a:graphicData>
-            </a:graphic>
-          </wp:inline>
-        </w:drawing>
-      </w:r>
-      <w:r>
-        <w:rPr>
-          <w:noProof/>
-        </w:rPr>
-        <w:drawing>
-          <wp:inline distT="0" distB="0" distL="0" distR="0" wp14:anchorId="45AB6DE5" wp14:editId="06E5B216">
-            <wp:extent cx="3597696" cy="2612328"/>
-            <wp:effectExtent l="0" t="0" r="3175" b="0"/>
-            <wp:docPr id="1038358935" name="Picture 3"/>
-            <wp:cNvGraphicFramePr>
-              <a:graphicFrameLocks xmlns:a="http://schemas.openxmlformats.org/drawingml/2006/main" noChangeAspect="1"/>
-            </wp:cNvGraphicFramePr>
-            <a:graphic xmlns:a="http://schemas.openxmlformats.org/drawingml/2006/main">
-              <a:graphicData uri="http://schemas.openxmlformats.org/drawingml/2006/picture">
-                <pic:pic xmlns:pic="http://schemas.openxmlformats.org/drawingml/2006/picture">
-                  <pic:nvPicPr>
-                    <pic:cNvPr id="0" name="Picture 3"/>
-                    <pic:cNvPicPr>
-                      <a:picLocks noChangeAspect="1" noChangeArrowheads="1"/>
-                    </pic:cNvPicPr>
-                  </pic:nvPicPr>
-                  <pic:blipFill>
-                    <a:blip r:embed="rId9">
-                      <a:extLst>
-                        <a:ext uri="{28A0092B-C50C-407E-A947-70E740481C1C}">
-                          <a14:useLocalDpi xmlns:a14="http://schemas.microsoft.com/office/drawing/2010/main" val="0"/>
-                        </a:ext>
-                      </a:extLst>
-                    </a:blip>
-                    <a:srcRect/>
-                    <a:stretch>
-                      <a:fillRect/>
-                    </a:stretch>
-                  </pic:blipFill>
-                  <pic:spPr bwMode="auto">
-                    <a:xfrm>
-                      <a:off x="0" y="0"/>
-                      <a:ext cx="3645436" cy="2646993"/>
-                    </a:xfrm>
-                    <a:prstGeom prst="rect">
-                      <a:avLst/>
-                    </a:prstGeom>
-                    <a:noFill/>
-                    <a:ln>
-                      <a:noFill/>
-                    </a:ln>
                   </pic:spPr>
                 </pic:pic>
               </a:graphicData>

</xml_diff>